<commit_message>
docs: reword the EDI report in plainer language
</commit_message>
<xml_diff>
--- a/docs/report/CampusOS_EDI_Project_Report.docx
+++ b/docs/report/CampusOS_EDI_Project_Report.docx
@@ -695,20 +695,10 @@
       <w:r>
         <w:rPr>
           <w:rFonts w:ascii="Times New Roman" w:cs="Times New Roman" w:eastAsia="Times New Roman" w:hAnsi="Times New Roman"/>
-          <w:b/>
-          <w:bCs/>
           <w:sz w:val="24"/>
           <w:szCs w:val="24"/>
         </w:rPr>
-        <w:t xml:space="preserve">Project:</w:t>
-      </w:r>
-      <w:r>
-        <w:rPr>
-          <w:rFonts w:ascii="Times New Roman" w:cs="Times New Roman" w:eastAsia="Times New Roman" w:hAnsi="Times New Roman"/>
-          <w:sz w:val="24"/>
-          <w:szCs w:val="24"/>
-        </w:rPr>
-        <w:t xml:space="preserve"> CampusOS: Smart Campus Management Platform (Team A6), a web platform for Marathwada Mitra Mandal's College of Engineering (MMCOE), Pune, that takes a campus event from the venue request to the final report: a club requests a venue, faculty approve or reject it, the event is published, students reserve a seat, reminders go out, and every decision is kept in an audit trail.</w:t>
+        <w:t xml:space="preserve">CampusOS: Smart Campus Management Platform (Team A6) is a web platform for Marathwada Mitra Mandal's College of Engineering (MMCOE), Pune. It handles a campus event from the venue request till the final report. A club requests a venue, faculty approve or reject it, the event is published, students reserve seats, reminders are sent, and every decision is stored in an audit trail.</w:t>
       </w:r>
     </w:p>
     <w:p>
@@ -1210,7 +1200,7 @@
           <w:sz w:val="24"/>
           <w:szCs w:val="24"/>
         </w:rPr>
-        <w:t xml:space="preserve">Finally, we thank the club heads, students and faculty members whose day-to-day experience of venue requests and event notices shaped the requirements of this project, and everyone who directly or indirectly contributed to its development.</w:t>
+        <w:t xml:space="preserve">We would also like to thank the club heads, students and faculty members whose experience with venue requests and event notices helped us decide the requirements, and everyone who helped us directly or indirectly during this project.</w:t>
       </w:r>
     </w:p>
     <w:p/>
@@ -7369,7 +7359,7 @@
           <w:sz w:val="24"/>
           <w:szCs w:val="24"/>
         </w:rPr>
-        <w:t xml:space="preserve">Every week at MMCOE, clubs organise workshops, competitions, guest lectures and cultural programmes, and each one needs a venue: a seminar hall, a laboratory, a classroom or an auditorium. Today a club head requests a venue by contacting the Department Event Coordinator over a paper form, e-mail, phone or a WhatsApp message. The coordinator checks availability in a register or spreadsheet, approves the request manually, and the event is then announced on notice boards and chat groups. Students register through Google Forms, and reports are compiled by hand.</w:t>
+        <w:t xml:space="preserve">At MMCOE, clubs conduct workshops, competitions, guest lectures and cultural programmes almost every week. Each of these needs a venue such as a seminar hall, laboratory, classroom or auditorium. At present, the club head asks the Department Event Coordinator for a venue through a paper form, e-mail, phone call or WhatsApp message. The coordinator checks a register or spreadsheet to see if the venue is free and then approves the request by hand. After that the event is announced on notice boards and in chat groups, students register through Google Forms, and reports are prepared manually.</w:t>
       </w:r>
     </w:p>
     <w:p>
@@ -7383,13 +7373,27 @@
           <w:sz w:val="24"/>
           <w:szCs w:val="24"/>
         </w:rPr>
-        <w:t xml:space="preserve">Because these channels are not connected, the same room can be promised to two clubs for the same time, approvals take days, students miss notices that are scattered across groups, and there is no single record of who approved or rejected what. The problem grows during college festivals, when many events are planned at once.</w:t>
+        <w:t xml:space="preserve">Since these channels are separate, the same room can get allotted to two clubs for the same time slot. Approvals can take several days, students miss notices that are spread across many groups, and there is no proper record of who approved or rejected a request. These problems become worse during college festivals when many events are planned together.</w:t>
       </w:r>
     </w:p>
     <w:p>
       <w:pPr>
         <w:spacing w:after="120" w:before="0" w:line="360"/>
         <w:jc w:val="both"/>
+      </w:pPr>
+      <w:r>
+        <w:rPr>
+          <w:rFonts w:ascii="Times New Roman" w:cs="Times New Roman" w:eastAsia="Times New Roman" w:hAnsi="Times New Roman"/>
+          <w:sz w:val="24"/>
+          <w:szCs w:val="24"/>
+        </w:rPr>
+        <w:t xml:space="preserve">CampusOS is a web based platform that brings this whole process into one place. The workflow of the system is as follows:</w:t>
+      </w:r>
+    </w:p>
+    <w:p>
+      <w:pPr>
+        <w:spacing w:after="120" w:before="0" w:line="360"/>
+        <w:jc w:val="center"/>
       </w:pPr>
       <w:r>
         <w:rPr>
@@ -7399,45 +7403,21 @@
           <w:sz w:val="24"/>
           <w:szCs w:val="24"/>
         </w:rPr>
-        <w:t xml:space="preserve">CampusOS</w:t>
-      </w:r>
+        <w:t xml:space="preserve">Club requests venue → Faculty approves → Event is published → Students reserve seats → Reminders go out → Reports and audit trail</w:t>
+      </w:r>
+    </w:p>
+    <w:p>
+      <w:pPr>
+        <w:spacing w:after="120" w:before="0" w:line="360"/>
+        <w:jc w:val="both"/>
+      </w:pPr>
       <w:r>
         <w:rPr>
           <w:rFonts w:ascii="Times New Roman" w:cs="Times New Roman" w:eastAsia="Times New Roman" w:hAnsi="Times New Roman"/>
           <w:sz w:val="24"/>
           <w:szCs w:val="24"/>
         </w:rPr>
-        <w:t xml:space="preserve"> is a centralised web platform that replaces this process with one transactional workflow:</w:t>
-      </w:r>
-    </w:p>
-    <w:p>
-      <w:pPr>
-        <w:spacing w:after="120" w:before="0" w:line="360"/>
-        <w:jc w:val="center"/>
-      </w:pPr>
-      <w:r>
-        <w:rPr>
-          <w:rFonts w:ascii="Times New Roman" w:cs="Times New Roman" w:eastAsia="Times New Roman" w:hAnsi="Times New Roman"/>
-          <w:b/>
-          <w:bCs/>
-          <w:sz w:val="24"/>
-          <w:szCs w:val="24"/>
-        </w:rPr>
-        <w:t xml:space="preserve">Club requests venue → Faculty approves → Event is published → Students reserve seats → Reminders go out → Reports and audit trail</w:t>
-      </w:r>
-    </w:p>
-    <w:p>
-      <w:pPr>
-        <w:spacing w:after="120" w:before="0" w:line="360"/>
-        <w:jc w:val="both"/>
-      </w:pPr>
-      <w:r>
-        <w:rPr>
-          <w:rFonts w:ascii="Times New Roman" w:cs="Times New Roman" w:eastAsia="Times New Roman" w:hAnsi="Times New Roman"/>
-          <w:sz w:val="24"/>
-          <w:szCs w:val="24"/>
-        </w:rPr>
-        <w:t xml:space="preserve">The system is built with a React single-page application, a Node.js/Express REST API, and a PostgreSQL database. Its most important rules — no overlapping approved bookings, no seats sold beyond capacity, no editing of the audit log — are enforced inside the database itself with row-level locks, an exclusion constraint and triggers, so they hold even if application code has a bug.</w:t>
+        <w:t xml:space="preserve">The front end is developed in React, the back end is a REST API written in Node.js and Express, and the data is stored in PostgreSQL. The important rules of the system are also checked inside the database. Two approved bookings cannot overlap, seats cannot go beyond the capacity of the event, and audit log entries cannot be edited. These rules are enforced using row-level locks, an exclusion constraint and triggers, so they still hold even if there is a mistake in the application code.</w:t>
       </w:r>
     </w:p>
     <w:p>
@@ -7466,7 +7446,7 @@
           <w:sz w:val="24"/>
           <w:szCs w:val="24"/>
         </w:rPr>
-        <w:t xml:space="preserve">To design and implement a secure, role-based web platform for MMCOE that automates venue booking, event approval, event publishing, student seat reservation, notifications and administrative reporting, and that guarantees conflict-free scheduling under simultaneous requests — while visibly applying the fundamentals of the second-year Information Technology curriculum.</w:t>
+        <w:t xml:space="preserve">The aim of this project is to develop a secure web platform for MMCOE in which venue booking, event approval, event publishing, seat reservation, notifications and reporting are done online according to the role of the user. The system should not allow conflicting bookings even when requests come at the same time. Along with this, the project aims to apply the concepts learnt in the second-year IT subjects.</w:t>
       </w:r>
     </w:p>
     <w:p>
@@ -7497,20 +7477,10 @@
       <w:r>
         <w:rPr>
           <w:rFonts w:ascii="Times New Roman" w:cs="Times New Roman" w:eastAsia="Times New Roman" w:hAnsi="Times New Roman"/>
-          <w:b/>
-          <w:bCs/>
           <w:sz w:val="24"/>
           <w:szCs w:val="24"/>
         </w:rPr>
-        <w:t xml:space="preserve">A real problem on our own campus.</w:t>
-      </w:r>
-      <w:r>
-        <w:rPr>
-          <w:rFonts w:ascii="Times New Roman" w:cs="Times New Roman" w:eastAsia="Times New Roman" w:hAnsi="Times New Roman"/>
-          <w:sz w:val="24"/>
-          <w:szCs w:val="24"/>
-        </w:rPr>
-        <w:t xml:space="preserve"> The double-booked hall and the missed workshop notice are experiences every team member has had; the users, roles and workflow come from how MMCOE clubs and departments actually work.</w:t>
+        <w:t xml:space="preserve">Most of our team members have faced a double-booked hall or missed a workshop because the notice reached them late. The roles and workflow used in the system are taken from the way clubs and departments work at MMCOE.</w:t>
       </w:r>
     </w:p>
     <w:p>
@@ -7526,20 +7496,10 @@
       <w:r>
         <w:rPr>
           <w:rFonts w:ascii="Times New Roman" w:cs="Times New Roman" w:eastAsia="Times New Roman" w:hAnsi="Times New Roman"/>
-          <w:b/>
-          <w:bCs/>
           <w:sz w:val="24"/>
           <w:szCs w:val="24"/>
         </w:rPr>
-        <w:t xml:space="preserve">A correctness problem, not only a form.</w:t>
-      </w:r>
-      <w:r>
-        <w:rPr>
-          <w:rFonts w:ascii="Times New Roman" w:cs="Times New Roman" w:eastAsia="Times New Roman" w:hAnsi="Times New Roman"/>
-          <w:sz w:val="24"/>
-          <w:szCs w:val="24"/>
-        </w:rPr>
-        <w:t xml:space="preserve"> Two clubs approved for the same room at the same instant is a classic concurrency problem. Solving it properly required transactions, locking and constraints from DBMS and OS rather than a simple availability check.</w:t>
+        <w:t xml:space="preserve">When two clubs get approval for the same room at the same moment, it becomes a concurrency problem. To handle it correctly we had to use transactions, locking and constraints that we studied in DBMS and OS, instead of only checking availability.</w:t>
       </w:r>
     </w:p>
     <w:p>
@@ -7555,20 +7515,10 @@
       <w:r>
         <w:rPr>
           <w:rFonts w:ascii="Times New Roman" w:cs="Times New Roman" w:eastAsia="Times New Roman" w:hAnsi="Times New Roman"/>
-          <w:b/>
-          <w:bCs/>
           <w:sz w:val="24"/>
           <w:szCs w:val="24"/>
         </w:rPr>
-        <w:t xml:space="preserve">The curriculum names it.</w:t>
-      </w:r>
-      <w:r>
-        <w:rPr>
-          <w:rFonts w:ascii="Times New Roman" w:cs="Times New Roman" w:eastAsia="Times New Roman" w:hAnsi="Times New Roman"/>
-          <w:sz w:val="24"/>
-          <w:szCs w:val="24"/>
-        </w:rPr>
-        <w:t xml:space="preserve"> The Website Development and Hosting course lists, as a project-based-learning topic, an end-to-end event management system with registrations, attendance, notifications and analytics — exactly the system described in our SRS.</w:t>
+        <w:t xml:space="preserve">The Website Development and Hosting syllabus has a PBL topic on an event management system with registrations, attendance, notifications and analytics. Our SRS covers the same requirements.</w:t>
       </w:r>
     </w:p>
     <w:p>
@@ -7584,20 +7534,10 @@
       <w:r>
         <w:rPr>
           <w:rFonts w:ascii="Times New Roman" w:cs="Times New Roman" w:eastAsia="Times New Roman" w:hAnsi="Times New Roman"/>
-          <w:b/>
-          <w:bCs/>
           <w:sz w:val="24"/>
           <w:szCs w:val="24"/>
         </w:rPr>
-        <w:t xml:space="preserve">Transparency and accountability.</w:t>
-      </w:r>
-      <w:r>
-        <w:rPr>
-          <w:rFonts w:ascii="Times New Roman" w:cs="Times New Roman" w:eastAsia="Times New Roman" w:hAnsi="Times New Roman"/>
-          <w:sz w:val="24"/>
-          <w:szCs w:val="24"/>
-        </w:rPr>
-        <w:t xml:space="preserve"> An immutable audit trail and exportable reports give faculty and the principal visibility that paper registers cannot.</w:t>
+        <w:t xml:space="preserve">Faculty and the principal need a clear record of decisions. An audit trail that cannot be edited and reports that can be downloaded give them this.</w:t>
       </w:r>
     </w:p>
     <w:p>
@@ -7801,7 +7741,7 @@
           <w:sz w:val="24"/>
           <w:szCs w:val="24"/>
         </w:rPr>
-        <w:t xml:space="preserve">The survey covers two groups of work: published campus event and venue-booking systems, which show what similar projects deliver and where they stop; and the foundational work on access control, concurrency control, deadlocks, web architecture and authentication on which CampusOS’s design decisions rest. Table 2.1 summarises the survey.</w:t>
+        <w:t xml:space="preserve">For the literature survey we studied two kinds of work. The first is published papers on college event management and venue booking systems, to understand what they provide and what they leave out. The second is standard work on access control, concurrency control, deadlocks, REST and authentication, which we used while designing CampusOS. Table 2.1 gives a summary.</w:t>
       </w:r>
     </w:p>
     <w:p>
@@ -8354,7 +8294,7 @@
                 <w:sz w:val="18"/>
                 <w:szCs w:val="18"/>
               </w:rPr>
-              <w:t xml:space="preserve">Closest to CampusOS. Availability is checked in the application; behaviour under simultaneous requests is not a stated design goal.</w:t>
+              <w:t xml:space="preserve">Closest to our project. Availability is checked in the application, and handling of simultaneous requests is not discussed.</w:t>
             </w:r>
           </w:p>
         </w:tc>
@@ -9876,7 +9816,7 @@
           <w:sz w:val="24"/>
           <w:szCs w:val="24"/>
         </w:rPr>
-        <w:t xml:space="preserve">Comparing the surveyed systems with the needs identified at MMCOE gives the gaps listed in Table 2.2. The common pattern is that existing college systems treat booking as a form plus an availability lookup; none of the surveyed papers states how the system behaves when two approvals for the same slot arrive at the same moment, and few model the departmental approval chain or keep an immutable record of decisions.</w:t>
+        <w:t xml:space="preserve">Table 2.2 compares the surveyed systems and the present manual process with CampusOS. In most existing systems, booking is a form along with a check for availability. The papers we surveyed do not explain what happens if two approvals for the same slot are given at the same moment. Very few of them follow a department-wise approval chain or keep a permanent record of decisions.</w:t>
       </w:r>
     </w:p>
     <w:p>
@@ -10872,7 +10812,7 @@
           <w:sz w:val="24"/>
           <w:szCs w:val="24"/>
         </w:rPr>
-        <w:t xml:space="preserve">At MMCOE, venue booking, event announcements, student registration and administrative record-keeping are handled through disconnected manual channels — paper forms, phone calls, chat groups, Google Forms and spreadsheets. As a result, the same venue can be booked by two clubs for the same time, approvals are slow and unrecorded, students miss events, and faculty have no reliable view of venue utilisation, club activity or attendance.</w:t>
+        <w:t xml:space="preserve">At present, venue booking, event announcements, student registration and record keeping at MMCOE are done through separate manual methods like paper forms, phone calls, chat groups, Google Forms and spreadsheets. Because of this, one venue can be booked by two clubs for the same time, approvals are slow and not recorded, students miss events, and faculty do not get a clear picture of venue usage, club activity or attendance.</w:t>
       </w:r>
     </w:p>
     <w:p>
@@ -10888,7 +10828,7 @@
           <w:sz w:val="24"/>
           <w:szCs w:val="24"/>
         </w:rPr>
-        <w:t xml:space="preserve">The problem is to build a centralised, role-based web platform that lets clubs request venues and faculty approve them online, guarantees that no two approved bookings overlap even under simultaneous requests, lets students discover events and reserve seats within capacity, notifies them automatically, and keeps an immutable, reportable record of every administrative decision.</w:t>
+        <w:t xml:space="preserve">To develop a role-based web platform in which clubs can request venues and faculty can approve them online, no two approved bookings can overlap even when requests are made at the same time, students can find events and reserve seats within the capacity, reminders are sent automatically, and every administrative decision is stored in a record that cannot be changed.</w:t>
       </w:r>
     </w:p>
     <w:p>
@@ -10944,7 +10884,7 @@
           <w:sz w:val="24"/>
           <w:szCs w:val="24"/>
         </w:rPr>
-        <w:t xml:space="preserve">The requirements below are taken from the team’s Software Requirements Specification (SRS), written following the structure of IEEE Std 830-1998. The SRS defines 21 numbered functional requirements (FR1–FR21) grouped into five modules, together with non-functional requirements for performance, security, reliability, usability and maintainability.</w:t>
+        <w:t xml:space="preserve">The requirements in this chapter are taken from our Software Requirements Specification (SRS), which follows the format of IEEE Std 830-1998. The SRS has 21 functional requirements (FR1 to FR21) divided into five modules, and non-functional requirements for performance, security, reliability, usability and maintainability.</w:t>
       </w:r>
     </w:p>
     <w:p>
@@ -15354,7 +15294,7 @@
           <w:sz w:val="24"/>
           <w:szCs w:val="24"/>
         </w:rPr>
-        <w:t xml:space="preserve">The system was built in phases, each delivered as a vertical slice in the order database → API → API testing (Postman and automated tests) → user interface. A frontend screen was never built against mock data before its API existed. Later phases added the course-wise applications of the syllabus.</w:t>
+        <w:t xml:space="preserve">The system was developed in phases. In every phase the database part was done first, then the API, then API testing using Postman and automated tests, and finally the user interface. No screen was made using dummy data before its API was ready. In the later phases we added the parts related to the syllabus subjects.</w:t>
       </w:r>
     </w:p>
     <w:p>
@@ -15542,7 +15482,7 @@
                 <w:sz w:val="20"/>
                 <w:szCs w:val="20"/>
               </w:rPr>
-              <w:t xml:space="preserve">0 — Foundation</w:t>
+              <w:t xml:space="preserve">0: Foundation</w:t>
             </w:r>
           </w:p>
         </w:tc>
@@ -15606,7 +15546,7 @@
                 <w:sz w:val="20"/>
                 <w:szCs w:val="20"/>
               </w:rPr>
-              <w:t xml:space="preserve">—</w:t>
+              <w:t xml:space="preserve">-</w:t>
             </w:r>
           </w:p>
         </w:tc>
@@ -15643,7 +15583,7 @@
                 <w:sz w:val="20"/>
                 <w:szCs w:val="20"/>
               </w:rPr>
-              <w:t xml:space="preserve">1 — Auth &amp; RBAC</w:t>
+              <w:t xml:space="preserve">1: Auth &amp; RBAC</w:t>
             </w:r>
           </w:p>
         </w:tc>
@@ -15744,7 +15684,7 @@
                 <w:sz w:val="20"/>
                 <w:szCs w:val="20"/>
               </w:rPr>
-              <w:t xml:space="preserve">2 — Venues &amp; scheduling</w:t>
+              <w:t xml:space="preserve">2: Venues &amp; scheduling</w:t>
             </w:r>
           </w:p>
         </w:tc>
@@ -15845,7 +15785,7 @@
                 <w:sz w:val="20"/>
                 <w:szCs w:val="20"/>
               </w:rPr>
-              <w:t xml:space="preserve">3 — Approvals &amp; clubs</w:t>
+              <w:t xml:space="preserve">3: Approvals &amp; clubs</w:t>
             </w:r>
           </w:p>
         </w:tc>
@@ -15946,7 +15886,7 @@
                 <w:sz w:val="20"/>
                 <w:szCs w:val="20"/>
               </w:rPr>
-              <w:t xml:space="preserve">4 — Events &amp; RSVP</w:t>
+              <w:t xml:space="preserve">4: Events &amp; RSVP</w:t>
             </w:r>
           </w:p>
         </w:tc>
@@ -16047,7 +15987,7 @@
                 <w:sz w:val="20"/>
                 <w:szCs w:val="20"/>
               </w:rPr>
-              <w:t xml:space="preserve">5 — Notifications</w:t>
+              <w:t xml:space="preserve">5: Notifications</w:t>
             </w:r>
           </w:p>
         </w:tc>
@@ -16148,7 +16088,7 @@
                 <w:sz w:val="20"/>
                 <w:szCs w:val="20"/>
               </w:rPr>
-              <w:t xml:space="preserve">6 — Governance</w:t>
+              <w:t xml:space="preserve">6: Governance</w:t>
             </w:r>
           </w:p>
         </w:tc>
@@ -16249,7 +16189,7 @@
                 <w:sz w:val="20"/>
                 <w:szCs w:val="20"/>
               </w:rPr>
-              <w:t xml:space="preserve">A–H — Syllabus alignment</w:t>
+              <w:t xml:space="preserve">A to H: Syllabus alignment</w:t>
             </w:r>
           </w:p>
         </w:tc>
@@ -16377,79 +16317,7 @@
           <w:sz w:val="24"/>
           <w:szCs w:val="24"/>
         </w:rPr>
-        <w:t xml:space="preserve">CampusOS follows a layered client–server architecture (Figure 4.1). The </w:t>
-      </w:r>
-      <w:r>
-        <w:rPr>
-          <w:rFonts w:ascii="Times New Roman" w:cs="Times New Roman" w:eastAsia="Times New Roman" w:hAnsi="Times New Roman"/>
-          <w:b/>
-          <w:bCs/>
-          <w:sz w:val="24"/>
-          <w:szCs w:val="24"/>
-        </w:rPr>
-        <w:t xml:space="preserve">client layer</w:t>
-      </w:r>
-      <w:r>
-        <w:rPr>
-          <w:rFonts w:ascii="Times New Roman" w:cs="Times New Roman" w:eastAsia="Times New Roman" w:hAnsi="Times New Roman"/>
-          <w:sz w:val="24"/>
-          <w:szCs w:val="24"/>
-        </w:rPr>
-        <w:t xml:space="preserve"> is the React web app used by all five roles, plus a static public page. The </w:t>
-      </w:r>
-      <w:r>
-        <w:rPr>
-          <w:rFonts w:ascii="Times New Roman" w:cs="Times New Roman" w:eastAsia="Times New Roman" w:hAnsi="Times New Roman"/>
-          <w:b/>
-          <w:bCs/>
-          <w:sz w:val="24"/>
-          <w:szCs w:val="24"/>
-        </w:rPr>
-        <w:t xml:space="preserve">API layer</w:t>
-      </w:r>
-      <w:r>
-        <w:rPr>
-          <w:rFonts w:ascii="Times New Roman" w:cs="Times New Roman" w:eastAsia="Times New Roman" w:hAnsi="Times New Roman"/>
-          <w:sz w:val="24"/>
-          <w:szCs w:val="24"/>
-        </w:rPr>
-        <w:t xml:space="preserve"> is a Node.js/Express server: every request passes the same pipeline — request id, security headers (helmet), CORS check, rate limit, JWT verification, role check and input validation — before it reaches a service. The </w:t>
-      </w:r>
-      <w:r>
-        <w:rPr>
-          <w:rFonts w:ascii="Times New Roman" w:cs="Times New Roman" w:eastAsia="Times New Roman" w:hAnsi="Times New Roman"/>
-          <w:b/>
-          <w:bCs/>
-          <w:sz w:val="24"/>
-          <w:szCs w:val="24"/>
-        </w:rPr>
-        <w:t xml:space="preserve">application layer</w:t>
-      </w:r>
-      <w:r>
-        <w:rPr>
-          <w:rFonts w:ascii="Times New Roman" w:cs="Times New Roman" w:eastAsia="Times New Roman" w:hAnsi="Times New Roman"/>
-          <w:sz w:val="24"/>
-          <w:szCs w:val="24"/>
-        </w:rPr>
-        <w:t xml:space="preserve"> contains the service modules (auth, users, venues, bookings, clubs, events, notifications/reminders, reports/audit) and a domain layer of plain classes and data structures. The </w:t>
-      </w:r>
-      <w:r>
-        <w:rPr>
-          <w:rFonts w:ascii="Times New Roman" w:cs="Times New Roman" w:eastAsia="Times New Roman" w:hAnsi="Times New Roman"/>
-          <w:b/>
-          <w:bCs/>
-          <w:sz w:val="24"/>
-          <w:szCs w:val="24"/>
-        </w:rPr>
-        <w:t xml:space="preserve">data layer</w:t>
-      </w:r>
-      <w:r>
-        <w:rPr>
-          <w:rFonts w:ascii="Times New Roman" w:cs="Times New Roman" w:eastAsia="Times New Roman" w:hAnsi="Times New Roman"/>
-          <w:sz w:val="24"/>
-          <w:szCs w:val="24"/>
-        </w:rPr>
-        <w:t xml:space="preserve"> is PostgreSQL, which holds 24 tables in third normal form and enforces the critical rules itself. An in-process background worker sends reminders and closes finished events; an SMTP server is used optionally for e-mail.</w:t>
+        <w:t xml:space="preserve">The architecture of CampusOS is shown in Figure 4.1. It is a layered client-server design. The client layer has the React web app, which is used by all five roles, and a static public page. The API layer is an Express server running on Node.js. Every request goes through the same steps before it reaches a service: a request id is attached, security headers are set, the origin is checked (CORS), the rate limit is applied, the JWT is verified, the role is checked and the input is validated. The application layer has the service modules (auth, users, venues, bookings, clubs, events, notifications and reminders, reports and audit) and a domain layer made of plain classes and data structures. The data layer is PostgreSQL with 24 tables in third normal form. A background worker running inside the server sends reminders and closes events that are over. An SMTP server can be connected for sending e-mails.</w:t>
       </w:r>
     </w:p>
     <w:p>
@@ -16534,7 +16402,7 @@
           <w:sz w:val="24"/>
           <w:szCs w:val="24"/>
         </w:rPr>
-        <w:t xml:space="preserve">Figure 4.2 shows the use cases of each actor. The roles form two inheritance chains: Student → Club Member → Club Head, and Faculty → Department Coordinator / Principal (Super Admin). A timer actor drives reminders.</w:t>
+        <w:t xml:space="preserve">The use case diagram in Figure 4.2 shows what each actor can do. The roles follow two chains of inheritance. Student, Club Member and Club Head form one chain, and Faculty, Department Coordinator and Principal (Super Admin) form the other. A timer actor triggers the reminders.</w:t>
       </w:r>
     </w:p>
     <w:p>
@@ -16619,7 +16487,7 @@
           <w:sz w:val="24"/>
           <w:szCs w:val="24"/>
         </w:rPr>
-        <w:t xml:space="preserve">Figure 4.3 shows the core of the database. A venue hosts many bookings; an event needs a booking; students hold seats through event registrations. The exclusion constraint on bookings and the capacity trigger on registrations are the two database-level guards.</w:t>
+        <w:t xml:space="preserve">Figure 4.3 shows the main tables of the database. One venue can have many bookings, each event needs a booking, and students get seats through event registrations. The exclusion constraint on the bookings table and the capacity trigger on the registrations table are the two checks done at the database level.</w:t>
       </w:r>
     </w:p>
     <w:p>
@@ -16894,7 +16762,7 @@
           <w:sz w:val="24"/>
           <w:szCs w:val="24"/>
         </w:rPr>
-        <w:t xml:space="preserve">SELECT the venue row … FOR UPDATE — concurrent approvals for that venue now wait in turn.</w:t>
+        <w:t xml:space="preserve">Lock the venue row using SELECT ... FOR UPDATE, so that other approvals for the same venue have to wait.</w:t>
       </w:r>
     </w:p>
     <w:p>
@@ -17124,61 +16992,7 @@
           <w:sz w:val="24"/>
           <w:szCs w:val="24"/>
         </w:rPr>
-        <w:t xml:space="preserve">For each upcoming event the student is eligible for, a score is computed from the student’s registration history: </w:t>
-      </w:r>
-      <w:r>
-        <w:rPr>
-          <w:rFonts w:ascii="Times New Roman" w:cs="Times New Roman" w:eastAsia="Times New Roman" w:hAnsi="Times New Roman"/>
-          <w:b/>
-          <w:bCs/>
-          <w:sz w:val="24"/>
-          <w:szCs w:val="24"/>
-        </w:rPr>
-        <w:t xml:space="preserve">+3 per earlier registration in the same category (counting at most 3)</w:t>
-      </w:r>
-      <w:r>
-        <w:rPr>
-          <w:rFonts w:ascii="Times New Roman" w:cs="Times New Roman" w:eastAsia="Times New Roman" w:hAnsi="Times New Roman"/>
-          <w:sz w:val="24"/>
-          <w:szCs w:val="24"/>
-        </w:rPr>
-        <w:t xml:space="preserve">, </w:t>
-      </w:r>
-      <w:r>
-        <w:rPr>
-          <w:rFonts w:ascii="Times New Roman" w:cs="Times New Roman" w:eastAsia="Times New Roman" w:hAnsi="Times New Roman"/>
-          <w:b/>
-          <w:bCs/>
-          <w:sz w:val="24"/>
-          <w:szCs w:val="24"/>
-        </w:rPr>
-        <w:t xml:space="preserve">+4 if the event is from a club the student attended before</w:t>
-      </w:r>
-      <w:r>
-        <w:rPr>
-          <w:rFonts w:ascii="Times New Roman" w:cs="Times New Roman" w:eastAsia="Times New Roman" w:hAnsi="Times New Roman"/>
-          <w:sz w:val="24"/>
-          <w:szCs w:val="24"/>
-        </w:rPr>
-        <w:t xml:space="preserve">, and </w:t>
-      </w:r>
-      <w:r>
-        <w:rPr>
-          <w:rFonts w:ascii="Times New Roman" w:cs="Times New Roman" w:eastAsia="Times New Roman" w:hAnsi="Times New Roman"/>
-          <w:b/>
-          <w:bCs/>
-          <w:sz w:val="24"/>
-          <w:szCs w:val="24"/>
-        </w:rPr>
-        <w:t xml:space="preserve">+2 if it is hosted by the student’s own department</w:t>
-      </w:r>
-      <w:r>
-        <w:rPr>
-          <w:rFonts w:ascii="Times New Roman" w:cs="Times New Roman" w:eastAsia="Times New Roman" w:hAnsi="Times New Roman"/>
-          <w:sz w:val="24"/>
-          <w:szCs w:val="24"/>
-        </w:rPr>
-        <w:t xml:space="preserve">. Each recommendation carries a human-readable reason. The top 20 of up to 100 scored events are selected with a binary min-heap in O(n + k log n) time, ties broken by the soonest date. No machine-learning model is used.</w:t>
+        <w:t xml:space="preserve">For every upcoming event that the student is eligible for, a score is calculated from the events the student registered for earlier. The event gets 3 points for each earlier registration in the same category (at most 3 are counted), 4 points if it is from a club whose event the student attended before, and 2 points if it is organised by the student’s own department. A short reason is shown with every recommendation. Out of up to 100 events, the best 20 are picked using a binary min-heap in O(n + k log n) time, and ties are broken by the earlier date. No machine learning model is used here.</w:t>
       </w:r>
     </w:p>
     <w:p>
@@ -17205,7 +17019,7 @@
           <w:sz w:val="24"/>
           <w:szCs w:val="24"/>
         </w:rPr>
-        <w:t xml:space="preserve">Campus buildings are nodes of a weighted undirected graph (adjacency list, built from the campus_paths table). Dijkstra’s algorithm with a min-heap, O((V + E) log V), ranks free venues by walking distance from the user’s location and returns the route. The seeded distances are illustrative placeholders, not measurements.</w:t>
+        <w:t xml:space="preserve">The buildings of the campus are stored as nodes of a weighted undirected graph (an adjacency list made from the campus_paths table). Dijkstra’s algorithm with a min-heap, which takes O((V + E) log V) time, is used to sort free venues by walking distance from the user and to show the route. The distances in the seed data are sample values and not actual measurements.</w:t>
       </w:r>
     </w:p>
     <w:p>
@@ -17236,20 +17050,10 @@
       <w:r>
         <w:rPr>
           <w:rFonts w:ascii="Times New Roman" w:cs="Times New Roman" w:eastAsia="Times New Roman" w:hAnsi="Times New Roman"/>
-          <w:b/>
-          <w:bCs/>
           <w:sz w:val="24"/>
           <w:szCs w:val="24"/>
         </w:rPr>
-        <w:t xml:space="preserve">Incremental, phase-wise development.</w:t>
-      </w:r>
-      <w:r>
-        <w:rPr>
-          <w:rFonts w:ascii="Times New Roman" w:cs="Times New Roman" w:eastAsia="Times New Roman" w:hAnsi="Times New Roman"/>
-          <w:sz w:val="24"/>
-          <w:szCs w:val="24"/>
-        </w:rPr>
-        <w:t xml:space="preserve"> Each phase was a vertical slice (database → API → tests → UI) that ended with all tests passing in continuous integration before the next began.</w:t>
+        <w:t xml:space="preserve">Incremental development: the work was split into phases, and each phase covered the database, API, tests and UI for a set of features. A phase was treated as complete only when all tests passed in CI.</w:t>
       </w:r>
     </w:p>
     <w:p>
@@ -17265,20 +17069,10 @@
       <w:r>
         <w:rPr>
           <w:rFonts w:ascii="Times New Roman" w:cs="Times New Roman" w:eastAsia="Times New Roman" w:hAnsi="Times New Roman"/>
-          <w:b/>
-          <w:bCs/>
           <w:sz w:val="24"/>
           <w:szCs w:val="24"/>
         </w:rPr>
-        <w:t xml:space="preserve">Database-first correctness.</w:t>
-      </w:r>
-      <w:r>
-        <w:rPr>
-          <w:rFonts w:ascii="Times New Roman" w:cs="Times New Roman" w:eastAsia="Times New Roman" w:hAnsi="Times New Roman"/>
-          <w:sz w:val="24"/>
-          <w:szCs w:val="24"/>
-        </w:rPr>
-        <w:t xml:space="preserve"> Rules that must never break are encoded as constraints and triggers in PostgreSQL in addition to the application code, giving two independent layers of protection.</w:t>
+        <w:t xml:space="preserve">Rules in the database: the rules that must never be broken are written as constraints and triggers in PostgreSQL as well as in the code, so there are two separate levels of checking.</w:t>
       </w:r>
     </w:p>
     <w:p>
@@ -17294,20 +17088,10 @@
       <w:r>
         <w:rPr>
           <w:rFonts w:ascii="Times New Roman" w:cs="Times New Roman" w:eastAsia="Times New Roman" w:hAnsi="Times New Roman"/>
-          <w:b/>
-          <w:bCs/>
           <w:sz w:val="24"/>
           <w:szCs w:val="24"/>
         </w:rPr>
-        <w:t xml:space="preserve">Test-driven verification.</w:t>
-      </w:r>
-      <w:r>
-        <w:rPr>
-          <w:rFonts w:ascii="Times New Roman" w:cs="Times New Roman" w:eastAsia="Times New Roman" w:hAnsi="Times New Roman"/>
-          <w:sz w:val="24"/>
-          <w:szCs w:val="24"/>
-        </w:rPr>
-        <w:t xml:space="preserve"> Unit, integration (against a real PostgreSQL database), concurrency, schema and UI flow tests; CI coverage gates that only ratchet upward.</w:t>
+        <w:t xml:space="preserve">Testing: we wrote unit tests, integration tests on a real PostgreSQL database, concurrency tests, schema tests and UI flow tests. The coverage limits in CI were only raised over time and never lowered.</w:t>
       </w:r>
     </w:p>
     <w:p>
@@ -17323,20 +17107,10 @@
       <w:r>
         <w:rPr>
           <w:rFonts w:ascii="Times New Roman" w:cs="Times New Roman" w:eastAsia="Times New Roman" w:hAnsi="Times New Roman"/>
-          <w:b/>
-          <w:bCs/>
           <w:sz w:val="24"/>
           <w:szCs w:val="24"/>
         </w:rPr>
-        <w:t xml:space="preserve">Version control and documentation discipline.</w:t>
-      </w:r>
-      <w:r>
-        <w:rPr>
-          <w:rFonts w:ascii="Times New Roman" w:cs="Times New Roman" w:eastAsia="Times New Roman" w:hAnsi="Times New Roman"/>
-          <w:sz w:val="24"/>
-          <w:szCs w:val="24"/>
-        </w:rPr>
-        <w:t xml:space="preserve"> One GitHub monorepo, a branching and commit convention, pull-request templates, and a dated change log (UPDATES.md) recording each change with its reasoning.</w:t>
+        <w:t xml:space="preserve">Version control: one GitHub repository with a branching and commit convention, pull request templates, and a dated change log (UPDATES.md) in which every change and its reason is written.</w:t>
       </w:r>
     </w:p>
     <w:p>
@@ -17352,20 +17126,10 @@
       <w:r>
         <w:rPr>
           <w:rFonts w:ascii="Times New Roman" w:cs="Times New Roman" w:eastAsia="Times New Roman" w:hAnsi="Times New Roman"/>
-          <w:b/>
-          <w:bCs/>
           <w:sz w:val="24"/>
           <w:szCs w:val="24"/>
         </w:rPr>
-        <w:t xml:space="preserve">Course-wise application.</w:t>
-      </w:r>
-      <w:r>
-        <w:rPr>
-          <w:rFonts w:ascii="Times New Roman" w:cs="Times New Roman" w:eastAsia="Times New Roman" w:hAnsi="Times New Roman"/>
-          <w:sz w:val="24"/>
-          <w:szCs w:val="24"/>
-        </w:rPr>
-        <w:t xml:space="preserve"> Data structures, OOP hierarchies and OS concepts were introduced only where they do real work in a feature, and every claim is mapped to code in the syllabus-mapping document.</w:t>
+        <w:t xml:space="preserve">Applying the subjects: data structures, OOP and OS concepts were added only where a feature actually needed them, and each one is mapped to the code in the syllabus mapping document.</w:t>
       </w:r>
     </w:p>
     <w:p>
@@ -17406,7 +17170,7 @@
           <w:sz w:val="24"/>
           <w:szCs w:val="24"/>
         </w:rPr>
-        <w:t xml:space="preserve">This chapter shows where each second-year IT course is applied in a working module of CampusOS. Only what is implemented is listed; topics that have no natural use in the project are stated as such rather than forced. Table 5.1 gives the overview.</w:t>
+        <w:t xml:space="preserve">This chapter explains where each second-year IT subject is used in CampusOS. We have listed only what is actually implemented. Topics that do not fit naturally in the project are mentioned as not used. Table 5.1 gives the overview.</w:t>
       </w:r>
     </w:p>
     <w:p>
@@ -18301,7 +18065,7 @@
           <w:sz w:val="24"/>
           <w:szCs w:val="24"/>
         </w:rPr>
-        <w:t xml:space="preserve">Seven structures were hand-written in backend/src/lib/ds/, each with its complexity documented and its own tests, and each doing a job in a real feature:</w:t>
+        <w:t xml:space="preserve">We wrote seven data structures ourselves in backend/src/lib/ds/. The time complexity of each one is noted in the code, each has its own tests, and each one is used in an actual feature:</w:t>
       </w:r>
     </w:p>
     <w:p>
@@ -19080,7 +18844,7 @@
           <w:sz w:val="24"/>
           <w:szCs w:val="24"/>
         </w:rPr>
-        <w:t xml:space="preserve">Correctness is checked against independent references, e.g. Dijkstra is compared with Floyd–Warshall on 200 random graphs, and merge sort with the built-in sort on 500 random arrays.</w:t>
+        <w:t xml:space="preserve">To check correctness, the results are compared with a reference method. For example, Dijkstra is compared with Floyd-Warshall on 200 random graphs, and merge sort is compared with the built-in sort on 500 random arrays.</w:t>
       </w:r>
     </w:p>
     <w:p>
@@ -19444,7 +19208,7 @@
           <w:sz w:val="24"/>
           <w:szCs w:val="24"/>
         </w:rPr>
-        <w:t xml:space="preserve"> an event’s free seats are modelled by SeatSemaphore — reserve is P (wait), cancel is V (signal).</w:t>
+        <w:t xml:space="preserve"> the free seats of an event are modelled by the SeatSemaphore class. Reserving a seat is the P (wait) operation and cancelling is the V (signal) operation.</w:t>
       </w:r>
     </w:p>
     <w:p>
@@ -19589,7 +19353,7 @@
           <w:sz w:val="24"/>
           <w:szCs w:val="24"/>
         </w:rPr>
-        <w:t xml:space="preserve">The system is an application-layer client–server design: the browser (development port 5173) talks to the API (port 5050) over HTTP using GET/POST/PATCH/DELETE with meaningful status codes, and the API talks to PostgreSQL over TCP. Refresh tokens travel in httpOnly cookies, CORS allows only listed origins, and rate limiting protects sign-in. Lower-layer topics (data link, IP routing, wireless) are not applicable to a web application.</w:t>
+        <w:t xml:space="preserve">CampusOS works at the application layer and uses the client-server model. The browser (port 5173 during development) sends HTTP requests to the API (port 5050) using GET, POST, PATCH and DELETE, and gets proper status codes in reply. The API connects to PostgreSQL over TCP. Refresh tokens are sent in httpOnly cookies, CORS allows only the listed origins, and rate limiting protects the sign-in route. Topics of the lower layers such as data link, IP routing and wireless networks do not apply to a web application.</w:t>
       </w:r>
     </w:p>
     <w:p>
@@ -19618,7 +19382,7 @@
           <w:sz w:val="24"/>
           <w:szCs w:val="24"/>
         </w:rPr>
-        <w:t xml:space="preserve">The main web app is a React single-page application using fetch and JSON against a REST API, with client- and server-side validation. A separate public information page (/about) is written in semantic HTML with hand-written CSS, Bootstrap and jQuery, and calls the API health endpoint with XMLHttpRequest. The project corresponds directly to the course’s PBL topic of an end-to-end event management system with registrations, attendance, notifications and analytics. Hosting and DNS are not covered because the project is not deployed.</w:t>
+        <w:t xml:space="preserve">The main web app is a React single-page application that uses fetch and JSON to talk to the REST API, and inputs are validated on both the client and the server. A separate public page (/about) is written in semantic HTML with our own CSS, Bootstrap and jQuery, and it calls the health endpoint of the API using XMLHttpRequest. The PBL topic of this course, an event management system with registrations, attendance, notifications and analytics, matches our project. Hosting and DNS are not covered since the project is not deployed.</w:t>
       </w:r>
     </w:p>
     <w:p>
@@ -19647,7 +19411,7 @@
           <w:sz w:val="24"/>
           <w:szCs w:val="24"/>
         </w:rPr>
-        <w:t xml:space="preserve">Each role sees a dashboard tailored to its tasks; components are accessible (labels, roles, skip link, reduced-motion support) and the colour palette was checked for contrast. Engineering practice includes the SRS with numbered requirements, UML/ER diagrams, a commit convention, continuous integration on every push, and a dated change log.</w:t>
+        <w:t xml:space="preserve">Each role gets a dashboard based on its work. The components are accessible, with labels, roles, a skip link and support for reduced motion, and the colours were checked for contrast. From the software engineering side, we wrote an SRS with numbered requirements, made UML and ER diagrams, followed a commit convention, ran CI on every push and kept a dated change log.</w:t>
       </w:r>
     </w:p>
     <w:p>
@@ -19703,7 +19467,7 @@
           <w:sz w:val="24"/>
           <w:szCs w:val="24"/>
         </w:rPr>
-        <w:t xml:space="preserve">The test target is the whole system: the Express API, the React web app and the PostgreSQL schema. Tests run automatically in GitHub Actions on every push, and a pull request below the coverage gate fails. Table 6.1 lists the levels of testing.</w:t>
+        <w:t xml:space="preserve">Testing covers the Express API, the React web app and the PostgreSQL schema. All tests run automatically in GitHub Actions on every push, and a pull request fails if the coverage goes below the set limit. The levels of testing are given in Table 6.1.</w:t>
       </w:r>
     </w:p>
     <w:p>
@@ -26786,7 +26550,7 @@
           <w:sz w:val="24"/>
           <w:szCs w:val="24"/>
         </w:rPr>
-        <w:t xml:space="preserve">All responses are far inside the SRS target of 3 seconds. This probe ran on one laptop against a small seeded database, so it is not a load test: the SRS target of 500 simultaneous users has not been verified. Two real defects were found by testing and fixed with regression tests — a deadlock between two club-membership functions, and a duplicate broadcast when an event was published twice at once.</w:t>
+        <w:t xml:space="preserve">All response times are much lower than the 3 second limit given in the SRS. However, this probe was run on one laptop with a small database, so it cannot be treated as a load test, and the target of 500 users at the same time has not been checked yet. During testing we found two real bugs, fixed them, and added tests so that they do not come back. The first was a deadlock between two club membership functions, and the second was a duplicate notification when the same event was published twice at the same time.</w:t>
       </w:r>
     </w:p>
     <w:p>
@@ -26847,7 +26611,7 @@
           <w:sz w:val="24"/>
           <w:szCs w:val="24"/>
         </w:rPr>
-        <w:t xml:space="preserve">Zero double bookings: enforced by row locking in the application and by an exclusion constraint in the database, and proved by a 20-way concurrent test.</w:t>
+        <w:t xml:space="preserve">Double bookings are not possible because of row locking in the code and an exclusion constraint in the database. A test with 20 approvals at the same time confirms this.</w:t>
       </w:r>
     </w:p>
     <w:p>
@@ -26866,7 +26630,7 @@
           <w:sz w:val="24"/>
           <w:szCs w:val="24"/>
         </w:rPr>
-        <w:t xml:space="preserve">Faster, recorded approvals: one-click approve / reject / request-changes, with competing requests resolved automatically and every decision in the audit trail.</w:t>
+        <w:t xml:space="preserve">Approvals are quicker and are recorded. Competing requests are rejected automatically and every decision is saved in the audit trail.</w:t>
       </w:r>
     </w:p>
     <w:p>
@@ -26885,7 +26649,7 @@
           <w:sz w:val="24"/>
           <w:szCs w:val="24"/>
         </w:rPr>
-        <w:t xml:space="preserve">One place for students to discover events, reserve a seat, receive reminders and leave feedback.</w:t>
+        <w:t xml:space="preserve">Students can find events, reserve seats, get reminders and give feedback from one place.</w:t>
       </w:r>
     </w:p>
     <w:p>
@@ -26904,7 +26668,7 @@
           <w:sz w:val="24"/>
           <w:szCs w:val="24"/>
         </w:rPr>
-        <w:t xml:space="preserve">Accountability through an append-only audit log of sign-ins, role changes and decisions.</w:t>
+        <w:t xml:space="preserve">Sign-ins, role changes and decisions are stored in an audit log which cannot be edited.</w:t>
       </w:r>
     </w:p>
     <w:p>
@@ -26923,7 +26687,7 @@
           <w:sz w:val="24"/>
           <w:szCs w:val="24"/>
         </w:rPr>
-        <w:t xml:space="preserve">Ready-made reports on venue utilisation, club activity and attendance, exportable as PDF and CSV.</w:t>
+        <w:t xml:space="preserve">Reports on venue usage, club activity and attendance can be downloaded as PDF and CSV.</w:t>
       </w:r>
     </w:p>
     <w:p>
@@ -26942,7 +26706,7 @@
           <w:sz w:val="24"/>
           <w:szCs w:val="24"/>
         </w:rPr>
-        <w:t xml:space="preserve">Secure by design: bcrypt hashes, short-lived JWTs with rotating refresh tokens, RBAC, rate limiting and input validation on every endpoint.</w:t>
+        <w:t xml:space="preserve">Passwords are stored as bcrypt hashes, and the system uses short-lived JWTs with rotating refresh tokens, RBAC, rate limiting and input validation.</w:t>
       </w:r>
     </w:p>
     <w:p>
@@ -26961,7 +26725,7 @@
           <w:sz w:val="24"/>
           <w:szCs w:val="24"/>
         </w:rPr>
-        <w:t xml:space="preserve">Zero licence cost: built entirely on open-source software.</w:t>
+        <w:t xml:space="preserve">There is no licence cost because only open-source software is used.</w:t>
       </w:r>
     </w:p>
     <w:p>
@@ -26980,7 +26744,7 @@
           <w:sz w:val="24"/>
           <w:szCs w:val="24"/>
         </w:rPr>
-        <w:t xml:space="preserve">Maintainable: modular layers, 1,278 automated tests and CI on every change.</w:t>
+        <w:t xml:space="preserve">The code is divided into modules and has 1,278 automated tests that run on every change, which makes it easier to maintain.</w:t>
       </w:r>
     </w:p>
     <w:p>
@@ -27014,7 +26778,7 @@
           <w:sz w:val="24"/>
           <w:szCs w:val="24"/>
         </w:rPr>
-        <w:t xml:space="preserve">Not deployed; it runs locally and in CI. Hosting, a domain and HTTPS are not set up.</w:t>
+        <w:t xml:space="preserve">The system is not deployed yet. It runs only on local machines and in CI, and hosting, domain and HTTPS are not set up.</w:t>
       </w:r>
     </w:p>
     <w:p>
@@ -27294,7 +27058,7 @@
           <w:sz w:val="24"/>
           <w:szCs w:val="24"/>
         </w:rPr>
-        <w:t xml:space="preserve">The implementation follows the end-to-end workflow of the system. Each step below corresponds to a screen of the web application and to the API and database logic described in Chapter 4.</w:t>
+        <w:t xml:space="preserve">The implementation follows the complete workflow of the system. Each step below is a screen in the web app and uses the API and database logic explained in Chapter 4.</w:t>
       </w:r>
     </w:p>
     <w:p>
@@ -27310,20 +27074,10 @@
       <w:r>
         <w:rPr>
           <w:rFonts w:ascii="Times New Roman" w:cs="Times New Roman" w:eastAsia="Times New Roman" w:hAnsi="Times New Roman"/>
-          <w:b/>
-          <w:bCs/>
           <w:sz w:val="24"/>
           <w:szCs w:val="24"/>
         </w:rPr>
-        <w:t xml:space="preserve">Sign up and sign in.</w:t>
-      </w:r>
-      <w:r>
-        <w:rPr>
-          <w:rFonts w:ascii="Times New Roman" w:cs="Times New Roman" w:eastAsia="Times New Roman" w:hAnsi="Times New Roman"/>
-          <w:sz w:val="24"/>
-          <w:szCs w:val="24"/>
-        </w:rPr>
-        <w:t xml:space="preserve"> A student signs up with a college e-mail, verifies it with a one-time code, and signs in. The API issues a short-lived access token and a refresh cookie, and the dashboard for the user’s role opens.</w:t>
+        <w:t xml:space="preserve">A student signs up using the college e-mail id, verifies it with a one-time code and then signs in. The API gives a short-lived access token and a refresh cookie, and the dashboard for that role is shown.</w:t>
       </w:r>
     </w:p>
     <w:p>
@@ -27339,20 +27093,10 @@
       <w:r>
         <w:rPr>
           <w:rFonts w:ascii="Times New Roman" w:cs="Times New Roman" w:eastAsia="Times New Roman" w:hAnsi="Times New Roman"/>
-          <w:b/>
-          <w:bCs/>
           <w:sz w:val="24"/>
           <w:szCs w:val="24"/>
         </w:rPr>
-        <w:t xml:space="preserve">Request a venue.</w:t>
-      </w:r>
-      <w:r>
-        <w:rPr>
-          <w:rFonts w:ascii="Times New Roman" w:cs="Times New Roman" w:eastAsia="Times New Roman" w:hAnsi="Times New Roman"/>
-          <w:sz w:val="24"/>
-          <w:szCs w:val="24"/>
-        </w:rPr>
-        <w:t xml:space="preserve"> A club head chooses building → floor → venue, a date and a time. The booking wizard checks for clashes live, applies the 15-minute buffer and suggests the nearest free times.</w:t>
+        <w:t xml:space="preserve">The club head selects the building, floor and venue along with the date and time. The booking wizard checks for clashes while the form is being filled, applies the 15 minute buffer and suggests the nearest free slots.</w:t>
       </w:r>
     </w:p>
     <w:p>
@@ -27368,20 +27112,10 @@
       <w:r>
         <w:rPr>
           <w:rFonts w:ascii="Times New Roman" w:cs="Times New Roman" w:eastAsia="Times New Roman" w:hAnsi="Times New Roman"/>
-          <w:b/>
-          <w:bCs/>
           <w:sz w:val="24"/>
           <w:szCs w:val="24"/>
         </w:rPr>
-        <w:t xml:space="preserve">Decide.</w:t>
-      </w:r>
-      <w:r>
-        <w:rPr>
-          <w:rFonts w:ascii="Times New Roman" w:cs="Times New Roman" w:eastAsia="Times New Roman" w:hAnsi="Times New Roman"/>
-          <w:sz w:val="24"/>
-          <w:szCs w:val="24"/>
-        </w:rPr>
-        <w:t xml:space="preserve"> The department coordinator sees competing requests in the approval inbox. Approving one locks the venue row, approves it, and rejects the competitors with a reason, all in one transaction.</w:t>
+        <w:t xml:space="preserve">The department coordinator sees the competing requests in the approval inbox. When one request is approved, the venue row is locked, that request is approved and the others are rejected with a reason, all inside one transaction.</w:t>
       </w:r>
     </w:p>
     <w:p>
@@ -27397,20 +27131,10 @@
       <w:r>
         <w:rPr>
           <w:rFonts w:ascii="Times New Roman" w:cs="Times New Roman" w:eastAsia="Times New Roman" w:hAnsi="Times New Roman"/>
-          <w:b/>
-          <w:bCs/>
           <w:sz w:val="24"/>
           <w:szCs w:val="24"/>
         </w:rPr>
-        <w:t xml:space="preserve">Publish and register.</w:t>
-      </w:r>
-      <w:r>
-        <w:rPr>
-          <w:rFonts w:ascii="Times New Roman" w:cs="Times New Roman" w:eastAsia="Times New Roman" w:hAnsi="Times New Roman"/>
-          <w:sz w:val="24"/>
-          <w:szCs w:val="24"/>
-        </w:rPr>
-        <w:t xml:space="preserve"> The club head publishes the approved event; students find it in the feed and reserve a seat. When seats run out the event shows as fully booked.</w:t>
+        <w:t xml:space="preserve">The club head publishes the approved event. Students see it in the events feed and reserve a seat. Once all seats are taken, the event is shown as fully booked.</w:t>
       </w:r>
     </w:p>
     <w:p>
@@ -27426,20 +27150,10 @@
       <w:r>
         <w:rPr>
           <w:rFonts w:ascii="Times New Roman" w:cs="Times New Roman" w:eastAsia="Times New Roman" w:hAnsi="Times New Roman"/>
-          <w:b/>
-          <w:bCs/>
           <w:sz w:val="24"/>
           <w:szCs w:val="24"/>
         </w:rPr>
-        <w:t xml:space="preserve">Remind and report.</w:t>
-      </w:r>
-      <w:r>
-        <w:rPr>
-          <w:rFonts w:ascii="Times New Roman" w:cs="Times New Roman" w:eastAsia="Times New Roman" w:hAnsi="Times New Roman"/>
-          <w:sz w:val="24"/>
-          <w:szCs w:val="24"/>
-        </w:rPr>
-        <w:t xml:space="preserve"> The worker sends reminders 48 h and 2 h before the event. Coordinators and the principal view the audit trail and export reports.</w:t>
+        <w:t xml:space="preserve">The worker sends reminders 48 hours and 2 hours before the event. Coordinators and the principal can see the audit trail and download reports.</w:t>
       </w:r>
     </w:p>
     <w:p>
@@ -27468,7 +27182,7 @@
           <w:sz w:val="24"/>
           <w:szCs w:val="24"/>
         </w:rPr>
-        <w:t xml:space="preserve">The screenshots below are taken from the running application with the seeded MMCOE data (six departments, one per floor of the academic building, and the clubs listed on the college website).</w:t>
+        <w:t xml:space="preserve">The screenshots below are taken from the running application using the seed data of MMCOE, which has six departments (one on each floor of the academic building) and the clubs listed on the college website.</w:t>
       </w:r>
     </w:p>
     <w:p>
@@ -28331,20 +28045,10 @@
       <w:r>
         <w:rPr>
           <w:rFonts w:ascii="Times New Roman" w:cs="Times New Roman" w:eastAsia="Times New Roman" w:hAnsi="Times New Roman"/>
-          <w:b/>
-          <w:bCs/>
           <w:sz w:val="24"/>
           <w:szCs w:val="24"/>
         </w:rPr>
-        <w:t xml:space="preserve">Summary of results:</w:t>
-      </w:r>
-      <w:r>
-        <w:rPr>
-          <w:rFonts w:ascii="Times New Roman" w:cs="Times New Roman" w:eastAsia="Times New Roman" w:hAnsi="Times New Roman"/>
-          <w:sz w:val="24"/>
-          <w:szCs w:val="24"/>
-        </w:rPr>
-        <w:t xml:space="preserve"> 20 of the 21 functional requirements are fully implemented and FR1 is implemented for college users; 1,278 automated tests pass with 98.7% backend and 94.2% frontend statement coverage; the four concurrency races (simultaneous approvals, last seat, double publish, lock order) each end with exactly the correct outcome; and measured response times are well under the 3-second target on the test machine.</w:t>
+        <w:t xml:space="preserve">In short, 20 out of 21 functional requirements are fully done, and FR1 is done for college users. All 1,278 automated tests pass, with 98.7% statement coverage on the back end and 94.2% on the front end. In all four concurrency tests (same-time approvals, last seat, double publish and lock order) the result is exactly as expected. Response times on the test machine are well below the 3 second limit.</w:t>
       </w:r>
     </w:p>
     <w:p>
@@ -28385,7 +28089,7 @@
           <w:sz w:val="24"/>
           <w:szCs w:val="24"/>
         </w:rPr>
-        <w:t xml:space="preserve">The project ran across the first semester of 2026–27. Table 9.1 gives the week-wise plan as it was carried out; dates are taken from the repository commit history and the weekly reports.</w:t>
+        <w:t xml:space="preserve">The project was done during the first semester of 2026-27. Table 9.1 shows the week-wise work. The dates are taken from the commit history of the repository and from the weekly reports.</w:t>
       </w:r>
     </w:p>
     <w:p>
@@ -30655,20 +30359,10 @@
       <w:r>
         <w:rPr>
           <w:rFonts w:ascii="Times New Roman" w:cs="Times New Roman" w:eastAsia="Times New Roman" w:hAnsi="Times New Roman"/>
-          <w:b/>
-          <w:bCs/>
           <w:sz w:val="24"/>
           <w:szCs w:val="24"/>
         </w:rPr>
-        <w:t xml:space="preserve">Risk management:</w:t>
-      </w:r>
-      <w:r>
-        <w:rPr>
-          <w:rFonts w:ascii="Times New Roman" w:cs="Times New Roman" w:eastAsia="Times New Roman" w:hAnsi="Times New Roman"/>
-          <w:sz w:val="24"/>
-          <w:szCs w:val="24"/>
-        </w:rPr>
-        <w:t xml:space="preserve"> concurrency correctness was identified early as the highest technical risk and was addressed with locking, database constraints and dedicated race tests; schedule risk was managed by building in independent vertical slices so that phases could be split among sub-teams.</w:t>
+        <w:t xml:space="preserve">From the start, handling of simultaneous requests was seen as the biggest technical risk, so we used locking, database constraints and separate race tests for it. To manage time, features were built as independent parts so that different sub-teams could work on them.</w:t>
       </w:r>
     </w:p>
     <w:p>
@@ -30724,7 +30418,7 @@
           <w:sz w:val="24"/>
           <w:szCs w:val="24"/>
         </w:rPr>
-        <w:t xml:space="preserve">CampusOS replaces MMCOE’s manual, scattered process for venue booking and event management with a single role-based web platform. Clubs request venues online, faculty decide with one click and a recorded reason, students discover events, reserve seats and receive reminders, and administrators have dashboards, an immutable audit trail and exportable reports.</w:t>
+        <w:t xml:space="preserve">CampusOS replaces the manual and scattered way of booking venues and managing events at MMCOE with one web platform that works according to the role of the user. Clubs can request venues online, faculty can approve or reject them with a reason, students can find events, reserve seats and get reminders, and the administration gets dashboards, an audit trail that cannot be edited, and reports that can be downloaded.</w:t>
       </w:r>
     </w:p>
     <w:p>
@@ -30738,7 +30432,7 @@
           <w:sz w:val="24"/>
           <w:szCs w:val="24"/>
         </w:rPr>
-        <w:t xml:space="preserve">The central technical result is that double bookings and overbooking are prevented not by a check that can race, but by transactions with row-level locks backed by an exclusion constraint and triggers in PostgreSQL — and this is demonstrated by automated tests in which twenty simultaneous requests always produce exactly one winner. The project also shows the second-year IT curriculum at work in a real system: data structures in scheduling and recommendations, OOP class hierarchies in access control and the booking state machine, normalisation, views, triggers and transactions in the database, semaphores, deadlock prevention and scheduling policies from operating systems, and HTTP, REST and web technologies in the client–server design. All 21 functional requirements are implemented (FR1 for college users), backed by 1,278 passing automated tests.</w:t>
+        <w:t xml:space="preserve">The main technical outcome of the project is the prevention of double bookings and overbooking. This is done using transactions with row-level locks, along with an exclusion constraint and triggers in PostgreSQL. In our automated tests, twenty requests sent at the same time always give exactly one successful result. The project also uses the concepts of our second-year subjects: data structures in scheduling and recommendations, OOP class hierarchies in access control and the booking state machine, normalisation, views, triggers and transactions in the database, semaphores, deadlock prevention and scheduling from OS, and HTTP, REST and web technologies in the client-server design. All 21 functional requirements are implemented (FR1 for college users), and all 1,278 automated tests pass.</w:t>
       </w:r>
     </w:p>
     <w:p>
@@ -30769,20 +30463,10 @@
       <w:r>
         <w:rPr>
           <w:rFonts w:ascii="Times New Roman" w:cs="Times New Roman" w:eastAsia="Times New Roman" w:hAnsi="Times New Roman"/>
-          <w:b/>
-          <w:bCs/>
           <w:sz w:val="24"/>
           <w:szCs w:val="24"/>
         </w:rPr>
-        <w:t xml:space="preserve">External participants:</w:t>
-      </w:r>
-      <w:r>
-        <w:rPr>
-          <w:rFonts w:ascii="Times New Roman" w:cs="Times New Roman" w:eastAsia="Times New Roman" w:hAnsi="Times New Roman"/>
-          <w:sz w:val="24"/>
-          <w:szCs w:val="24"/>
-        </w:rPr>
-        <w:t xml:space="preserve"> sign-up for students from other colleges using e-mail and a one-time code, controlled by a per-event “open to other colleges” switch.</w:t>
+        <w:t xml:space="preserve">Sign-up for students from other colleges using e-mail and a one-time code, with a switch on each event to allow outside students.</w:t>
       </w:r>
     </w:p>
     <w:p>
@@ -30798,20 +30482,10 @@
       <w:r>
         <w:rPr>
           <w:rFonts w:ascii="Times New Roman" w:cs="Times New Roman" w:eastAsia="Times New Roman" w:hAnsi="Times New Roman"/>
-          <w:b/>
-          <w:bCs/>
           <w:sz w:val="24"/>
           <w:szCs w:val="24"/>
         </w:rPr>
-        <w:t xml:space="preserve">Classroom approval chain:</w:t>
-      </w:r>
-      <w:r>
-        <w:rPr>
-          <w:rFonts w:ascii="Times New Roman" w:cs="Times New Roman" w:eastAsia="Times New Roman" w:hAnsi="Times New Roman"/>
-          <w:sz w:val="24"/>
-          <w:szCs w:val="24"/>
-        </w:rPr>
-        <w:t xml:space="preserve"> a classroom-specific chain (club head → faculty coordinator → institute timetable coordinator → department timetable coordinator) so that event bookings never clash with the teaching timetable.</w:t>
+        <w:t xml:space="preserve">A separate approval chain for classrooms (club head, faculty coordinator, institute timetable coordinator and department timetable coordinator) so that event bookings do not clash with lectures.</w:t>
       </w:r>
     </w:p>
     <w:p>
@@ -30827,20 +30501,10 @@
       <w:r>
         <w:rPr>
           <w:rFonts w:ascii="Times New Roman" w:cs="Times New Roman" w:eastAsia="Times New Roman" w:hAnsi="Times New Roman"/>
-          <w:b/>
-          <w:bCs/>
           <w:sz w:val="24"/>
           <w:szCs w:val="24"/>
         </w:rPr>
-        <w:t xml:space="preserve">Deployment and load testing:</w:t>
-      </w:r>
-      <w:r>
-        <w:rPr>
-          <w:rFonts w:ascii="Times New Roman" w:cs="Times New Roman" w:eastAsia="Times New Roman" w:hAnsi="Times New Roman"/>
-          <w:sz w:val="24"/>
-          <w:szCs w:val="24"/>
-        </w:rPr>
-        <w:t xml:space="preserve"> host the system with HTTPS and verify the 500-concurrent-user target.</w:t>
+        <w:t xml:space="preserve">Deploying the system with HTTPS and testing it with 500 users at the same time.</w:t>
       </w:r>
     </w:p>
     <w:p>
@@ -30856,20 +30520,10 @@
       <w:r>
         <w:rPr>
           <w:rFonts w:ascii="Times New Roman" w:cs="Times New Roman" w:eastAsia="Times New Roman" w:hAnsi="Times New Roman"/>
-          <w:b/>
-          <w:bCs/>
           <w:sz w:val="24"/>
           <w:szCs w:val="24"/>
         </w:rPr>
-        <w:t xml:space="preserve">QR-code check-in</w:t>
-      </w:r>
-      <w:r>
-        <w:rPr>
-          <w:rFonts w:ascii="Times New Roman" w:cs="Times New Roman" w:eastAsia="Times New Roman" w:hAnsi="Times New Roman"/>
-          <w:sz w:val="24"/>
-          <w:szCs w:val="24"/>
-        </w:rPr>
-        <w:t xml:space="preserve"> at the venue for live attendance.</w:t>
+        <w:t xml:space="preserve">QR code check-in at the venue for marking attendance.</w:t>
       </w:r>
     </w:p>
     <w:p>
@@ -30885,20 +30539,10 @@
       <w:r>
         <w:rPr>
           <w:rFonts w:ascii="Times New Roman" w:cs="Times New Roman" w:eastAsia="Times New Roman" w:hAnsi="Times New Roman"/>
-          <w:b/>
-          <w:bCs/>
           <w:sz w:val="24"/>
           <w:szCs w:val="24"/>
         </w:rPr>
-        <w:t xml:space="preserve">Mobile application</w:t>
-      </w:r>
-      <w:r>
-        <w:rPr>
-          <w:rFonts w:ascii="Times New Roman" w:cs="Times New Roman" w:eastAsia="Times New Roman" w:hAnsi="Times New Roman"/>
-          <w:sz w:val="24"/>
-          <w:szCs w:val="24"/>
-        </w:rPr>
-        <w:t xml:space="preserve"> with push notifications.</w:t>
+        <w:t xml:space="preserve">A mobile app with push notifications.</w:t>
       </w:r>
     </w:p>
     <w:p>
@@ -30914,20 +30558,10 @@
       <w:r>
         <w:rPr>
           <w:rFonts w:ascii="Times New Roman" w:cs="Times New Roman" w:eastAsia="Times New Roman" w:hAnsi="Times New Roman"/>
-          <w:b/>
-          <w:bCs/>
           <w:sz w:val="24"/>
           <w:szCs w:val="24"/>
         </w:rPr>
-        <w:t xml:space="preserve">Data retention and privacy:</w:t>
-      </w:r>
-      <w:r>
-        <w:rPr>
-          <w:rFonts w:ascii="Times New Roman" w:cs="Times New Roman" w:eastAsia="Times New Roman" w:hAnsi="Times New Roman"/>
-          <w:sz w:val="24"/>
-          <w:szCs w:val="24"/>
-        </w:rPr>
-        <w:t xml:space="preserve"> consent notice, data export and erasure, and purging of expired records.</w:t>
+        <w:t xml:space="preserve">Better data privacy, including a consent notice, export and deletion of personal data, and removal of old records.</w:t>
       </w:r>
     </w:p>
     <w:p>
@@ -31059,7 +30693,7 @@
           <w:sz w:val="24"/>
           <w:szCs w:val="24"/>
         </w:rPr>
-        <w:t xml:space="preserve">PostgreSQL Global Development Group, PostgreSQL 16 Documentation — Explicit Locking, Constraints, Triggers. https://www.postgresql.org/docs/16/</w:t>
+        <w:t xml:space="preserve">PostgreSQL Global Development Group, PostgreSQL 16 Documentation: Explicit Locking, Constraints, Triggers. https://www.postgresql.org/docs/16/</w:t>
       </w:r>
     </w:p>
     <w:p>

</xml_diff>